<commit_message>
Data, AI Feasibility, Legal, Policy, & Action Plan
This is updated progress after completing all parts successfully, covering parts 4, 6 , and part of 8.
</commit_message>
<xml_diff>
--- a/RanadBaobaidPart4-6-8.docx
+++ b/RanadBaobaidPart4-6-8.docx
@@ -3,6 +3,21 @@
 <w:document xmlns:wpc="http://schemas.microsoft.com/office/word/2010/wordprocessingCanvas" xmlns:cx="http://schemas.microsoft.com/office/drawing/2014/chartex" xmlns:cx1="http://schemas.microsoft.com/office/drawing/2015/9/8/chartex" xmlns:cx2="http://schemas.microsoft.com/office/drawing/2015/10/21/chartex" xmlns:cx3="http://schemas.microsoft.com/office/drawing/2016/5/9/chartex" xmlns:cx4="http://schemas.microsoft.com/office/drawing/2016/5/10/chartex" xmlns:cx5="http://schemas.microsoft.com/office/drawing/2016/5/11/chartex" xmlns:cx6="http://schemas.microsoft.com/office/drawing/2016/5/12/chartex" xmlns:cx7="http://schemas.microsoft.com/office/drawing/2016/5/13/chartex" xmlns:cx8="http://schemas.microsoft.com/office/drawing/2016/5/14/chartex" xmlns:mc="http://schemas.openxmlformats.org/markup-compatibility/2006" xmlns:aink="http://schemas.microsoft.com/office/drawing/2016/ink" xmlns:am3d="http://schemas.microsoft.com/office/drawing/2017/model3d" xmlns:o="urn:schemas-microsoft-com:office:office" xmlns:oel="http://schemas.microsoft.com/office/2019/extlst" xmlns:r="http://schemas.openxmlformats.org/officeDocument/2006/relationships" xmlns:m="http://schemas.openxmlformats.org/officeDocument/2006/math" xmlns:v="urn:schemas-microsoft-com:vml" xmlns:wp14="http://schemas.microsoft.com/office/word/2010/wordprocessingDrawing" xmlns:wp="http://schemas.openxmlformats.org/drawingml/2006/wordprocessingDrawing" xmlns:w10="urn:schemas-microsoft-com:office:word" xmlns:w="http://schemas.openxmlformats.org/wordprocessingml/2006/main" xmlns:w14="http://schemas.microsoft.com/office/word/2010/wordml" xmlns:w15="http://schemas.microsoft.com/office/word/2012/wordml" xmlns:w16cex="http://schemas.microsoft.com/office/word/2018/wordml/cex" xmlns:w16cid="http://schemas.microsoft.com/office/word/2016/wordml/cid" xmlns:w16="http://schemas.microsoft.com/office/word/2018/wordml" xmlns:w16du="http://schemas.microsoft.com/office/word/2023/wordml/word16du" xmlns:w16sdtdh="http://schemas.microsoft.com/office/word/2020/wordml/sdtdatahash" xmlns:w16sdtfl="http://schemas.microsoft.com/office/word/2024/wordml/sdtformatlock" xmlns:w16se="http://schemas.microsoft.com/office/word/2015/wordml/symex" xmlns:wpg="http://schemas.microsoft.com/office/word/2010/wordprocessingGroup" xmlns:wpi="http://schemas.microsoft.com/office/word/2010/wordprocessingInk" xmlns:wne="http://schemas.microsoft.com/office/word/2006/wordml" xmlns:wps="http://schemas.microsoft.com/office/word/2010/wordprocessingShape" mc:Ignorable="w14 w15 w16se w16cid w16 w16cex w16sdtdh w16sdtfl w16du wp14">
   <w:body>
     <w:p>
+      <w:r>
+        <w:rPr>
+          <w:b/>
+          <w:bCs/>
+        </w:rPr>
+        <w:t>4 Data and AI Feasibility</w:t>
+      </w:r>
+    </w:p>
+    <w:p>
+      <w:pPr>
+        <w:rPr>
+          <w:b/>
+          <w:bCs/>
+        </w:rPr>
+      </w:pPr>
       <w:r>
         <w:rPr>
           <w:b/>
@@ -600,7 +615,6 @@
     <w:p/>
     <w:p>
       <w:r>
-        <w:lastRenderedPageBreak/>
         <w:t xml:space="preserve">45 records will be used from our initial evaluation. An extensive image was given in Section 3.7 that aims for a bigger capacity scenario </w:t>
       </w:r>
       <w:proofErr w:type="gramStart"/>
@@ -637,6 +651,12 @@
     </w:p>
     <w:p/>
     <w:p>
+      <w:pPr>
+        <w:rPr>
+          <w:b/>
+          <w:bCs/>
+        </w:rPr>
+      </w:pPr>
       <w:r>
         <w:rPr>
           <w:b/>
@@ -658,10 +678,10 @@
     <w:p>
       <w:r>
         <w:drawing>
-          <wp:inline distT="0" distB="0" distL="0" distR="0" wp14:anchorId="68F04E94" wp14:editId="4C50400F">
+          <wp:inline distT="0" distB="0" distL="0" distR="0" wp14:anchorId="560292B5" wp14:editId="4EEBAFE0">
             <wp:extent cx="4552950" cy="561975"/>
             <wp:effectExtent l="0" t="0" r="0" b="9525"/>
-            <wp:docPr id="874602710" name="Picture 2"/>
+            <wp:docPr id="1525091347" name="Picture 2"/>
             <wp:cNvGraphicFramePr>
               <a:graphicFrameLocks xmlns:a="http://schemas.openxmlformats.org/drawingml/2006/main" noChangeAspect="1"/>
             </wp:cNvGraphicFramePr>
@@ -739,12 +759,14 @@
         <w:t xml:space="preserve"> preserve privacy rights, the sample data set will contain fictional IDs only. Personal contacts and confidential university information will be excluded. Future use of real records will require appropriate permissions. Sensitive information will be excluded from the dataset. Only necessary information of AI function will be shared with an external AI service</w:t>
       </w:r>
     </w:p>
-    <w:p>
-      <w:r>
-        <w:br/>
-      </w:r>
-    </w:p>
-    <w:p>
+    <w:p/>
+    <w:p>
+      <w:pPr>
+        <w:rPr>
+          <w:b/>
+          <w:bCs/>
+        </w:rPr>
+      </w:pPr>
       <w:r>
         <w:rPr>
           <w:b/>
@@ -823,24 +845,29 @@
         <w:t>This is an illustrative acceptance calculation, not a measured result. When fewer recommendations are returned, the calculation will use the actual number of recommendations reviewed. Items with no relevant results will be considered separately. AI matching and keyword search will be run on the same requests and relevance criteria.</w:t>
       </w:r>
     </w:p>
+    <w:p>
+      <w:r>
+        <w:t>AI reports would summarize verified database records and calculated totals. Sustainable action recommendations would need condition, repair-cost, and sustainability information. Natural language assistants would need reliable system records and approved policy information.</w:t>
+      </w:r>
+    </w:p>
+    <w:p>
+      <w:r>
+        <w:t>Access to university computing resources or approved AI services would be assumed only if offered and is unproven. An API is one possible integration option. Searches, filters, and standard reports would stay available if AI was unavailable.</w:t>
+      </w:r>
+    </w:p>
+    <w:p>
+      <w:r>
+        <w:t>AI can therefore be integrated conditionally for a limited prototype, given the right tools, access, data, and satisfactory evaluation. A small sample would not prove performance over the whole university.</w:t>
+      </w:r>
+    </w:p>
     <w:p/>
     <w:p>
-      <w:r>
-        <w:t>AI reports would summarize verified database records and calculated totals. Sustainable action recommendations would need condition, repair-cost, and sustainability information. Natural language assistants would need reliable system records and approved policy information.</w:t>
-      </w:r>
-    </w:p>
-    <w:p>
-      <w:r>
-        <w:t>Access to university computing resources or approved AI services would be assumed only if offered and is unproven. An API is one possible integration option. Searches, filters, and standard reports would stay available if AI was unavailable.</w:t>
-      </w:r>
-    </w:p>
-    <w:p>
-      <w:r>
-        <w:t>AI can therefore be integrated conditionally for a limited prototype, given the right tools, access, data, and satisfactory evaluation. A small sample would not prove performance over the whole university.</w:t>
-      </w:r>
-    </w:p>
-    <w:p/>
-    <w:p>
+      <w:pPr>
+        <w:rPr>
+          <w:b/>
+          <w:bCs/>
+        </w:rPr>
+      </w:pPr>
       <w:r>
         <w:rPr>
           <w:b/>
@@ -887,11 +914,7 @@
         <w:t>Matching:</w:t>
       </w:r>
       <w:r>
-        <w:t xml:space="preserve"> AI-based matching and ordinary keyword search will use identical requests and relevance criteria. The recommendations will be evaluated against the requested purpose, specifications, quantity, and condition. The proposed AI </w:t>
-      </w:r>
-      <w:r>
-        <w:lastRenderedPageBreak/>
-        <w:t>relevance target is at least 75%, as explained in Section 4.3. The comparison will demonstrate whether AI delivers an improvement.</w:t>
+        <w:t xml:space="preserve"> AI-based matching and ordinary keyword search will use identical requests and relevance criteria. The recommendations will be evaluated against the requested purpose, specifications, quantity, and condition. The proposed AI relevance target is at least 75%, as explained in Section 4.3. The comparison will demonstrate whether AI delivers an improvement.</w:t>
       </w:r>
     </w:p>
     <w:p>
@@ -906,6 +929,7 @@
           <w:b/>
           <w:bCs/>
         </w:rPr>
+        <w:lastRenderedPageBreak/>
         <w:t>Explanations and reports:</w:t>
       </w:r>
       <w:r>
@@ -920,7 +944,14 @@
         </w:numPr>
       </w:pPr>
       <w:r>
-        <w:t>Acceptance and explanation usefulness: the test participants will state whether they would accept every reviewed recommendation and whether its explanation is helpful or not. The team will evaluate:</w:t>
+        <w:rPr>
+          <w:b/>
+          <w:bCs/>
+        </w:rPr>
+        <w:t>Acceptance and explanation usefulness:</w:t>
+      </w:r>
+      <w:r>
+        <w:t xml:space="preserve"> the test participants will state whether they would accept every reviewed recommendation and whether its explanation is helpful or not. The team will evaluate:</w:t>
       </w:r>
     </w:p>
     <w:p>
@@ -965,24 +996,32 @@
       <w:r>
         <w:t>If AI services are unavailable, users will be able to enter categories manually, use ordinary search and filtering, and access standard reports. Evaluation results and errors will be recorded to support improvements. Conclusions will be limited to the small sample tested. The AI tool and model versions that were used for evaluation purposes shall be documented to facilitate consistent comparison in the future</w:t>
       </w:r>
-    </w:p>
-    <w:p>
-      <w:r>
-        <w:br/>
-      </w:r>
-      <w:r>
-        <w:br/>
-      </w:r>
-      <w:r>
-        <w:br/>
-      </w:r>
-    </w:p>
-    <w:p>
-      <w:r>
+      <w:r>
+        <w:t>.</w:t>
+      </w:r>
+    </w:p>
+    <w:p/>
+    <w:p/>
+    <w:p/>
+    <w:p/>
+    <w:p/>
+    <w:p/>
+    <w:p/>
+    <w:p/>
+    <w:p/>
+    <w:p>
+      <w:pPr>
         <w:rPr>
           <w:b/>
           <w:bCs/>
         </w:rPr>
+      </w:pPr>
+      <w:r>
+        <w:rPr>
+          <w:b/>
+          <w:bCs/>
+        </w:rPr>
+        <w:lastRenderedPageBreak/>
         <w:t>6. Legal, Ethical, and Policy Feasibility </w:t>
       </w:r>
     </w:p>
@@ -1006,11 +1045,7 @@
         <w:t>Privacy and legal requirements:</w:t>
       </w:r>
       <w:r>
-        <w:t xml:space="preserve"> The initial development is to be based on fictional records, as described in Section 4.2. The team will verify the authorizations and applicable data-protection requirements for the use of university records before </w:t>
-      </w:r>
-      <w:r>
-        <w:lastRenderedPageBreak/>
-        <w:t xml:space="preserve">implementation. Access to the confidential financial, procurement, and personal information of the university will be restricted. Software, models, datasets, and images will be checked for suitable </w:t>
+        <w:t xml:space="preserve"> The initial development is to be based on fictional records, as described in Section 4.2. The team will verify the authorizations and applicable data-protection requirements for the use of university records before implementation. Access to the confidential financial, procurement, and personal information of the university will be restricted. Software, models, datasets, and images will be checked for suitable </w:t>
       </w:r>
       <w:proofErr w:type="spellStart"/>
       <w:r>
@@ -1117,6 +1152,7 @@
     </w:p>
     <w:p>
       <w:r>
+        <w:lastRenderedPageBreak/>
         <w:t xml:space="preserve">The prototype using synthetic data can be developed under these assumptions. The use of the university records and assets will be dependent on the confirmation of the policies, permissions, and the validation of the controls. For later prototype testing, the proposed control targets are 100% of unauthorized-access attempts blocked and 100% of completed transfer and disposal test cases supported by the required approvals. None </w:t>
       </w:r>
       <w:proofErr w:type="gramStart"/>
@@ -1126,6 +1162,55 @@
       <w:proofErr w:type="gramEnd"/>
       <w:r>
         <w:t xml:space="preserve"> been measured as of now.</w:t>
+      </w:r>
+    </w:p>
+    <w:p/>
+    <w:p/>
+    <w:p>
+      <w:pPr>
+        <w:rPr>
+          <w:b/>
+          <w:bCs/>
+          <w:sz w:val="28"/>
+          <w:szCs w:val="28"/>
+        </w:rPr>
+      </w:pPr>
+      <w:r>
+        <w:rPr>
+          <w:b/>
+          <w:bCs/>
+          <w:sz w:val="28"/>
+          <w:szCs w:val="28"/>
+        </w:rPr>
+        <w:t>8. Recommendations &amp; Contribution</w:t>
+      </w:r>
+    </w:p>
+    <w:p>
+      <w:pPr>
+        <w:rPr>
+          <w:b/>
+          <w:bCs/>
+        </w:rPr>
+      </w:pPr>
+      <w:r>
+        <w:rPr>
+          <w:b/>
+          <w:bCs/>
+        </w:rPr>
+        <w:t>8.2 Action Plan</w:t>
+      </w:r>
+    </w:p>
+    <w:p>
+      <w:r>
+        <w:t xml:space="preserve">The team will follow the duties and deadlines in Table 7.1, Section 7.2. It will prioritize ensuring access tools to the proposed tools, reviewing the </w:t>
+      </w:r>
+      <w:proofErr w:type="spellStart"/>
+      <w:r>
+        <w:t>licences</w:t>
+      </w:r>
+      <w:proofErr w:type="spellEnd"/>
+      <w:r>
+        <w:t xml:space="preserve"> and costs, and preparing the 45 synthetic records according to the quality control measures of Section 4.2. The university will need to approve the use of the real records. The development will cover the minimum traditional and AI functions and will be reviewed weekly to monitor the progress and outstanding risks. The prototype will be tested to ensure that the agreed success targets are met, and if any problems are found, they will be addressed and retested ahead of the final demonstration</w:t>
       </w:r>
     </w:p>
     <w:p/>
@@ -1142,9 +1227,9 @@
 <file path=word/numbering.xml><?xml version="1.0" encoding="utf-8"?>
 <w:numbering xmlns:wpc="http://schemas.microsoft.com/office/word/2010/wordprocessingCanvas" xmlns:cx="http://schemas.microsoft.com/office/drawing/2014/chartex" xmlns:cx1="http://schemas.microsoft.com/office/drawing/2015/9/8/chartex" xmlns:cx2="http://schemas.microsoft.com/office/drawing/2015/10/21/chartex" xmlns:cx3="http://schemas.microsoft.com/office/drawing/2016/5/9/chartex" xmlns:cx4="http://schemas.microsoft.com/office/drawing/2016/5/10/chartex" xmlns:cx5="http://schemas.microsoft.com/office/drawing/2016/5/11/chartex" xmlns:cx6="http://schemas.microsoft.com/office/drawing/2016/5/12/chartex" xmlns:cx7="http://schemas.microsoft.com/office/drawing/2016/5/13/chartex" xmlns:cx8="http://schemas.microsoft.com/office/drawing/2016/5/14/chartex" xmlns:mc="http://schemas.openxmlformats.org/markup-compatibility/2006" xmlns:aink="http://schemas.microsoft.com/office/drawing/2016/ink" xmlns:am3d="http://schemas.microsoft.com/office/drawing/2017/model3d" xmlns:o="urn:schemas-microsoft-com:office:office" xmlns:oel="http://schemas.microsoft.com/office/2019/extlst" xmlns:r="http://schemas.openxmlformats.org/officeDocument/2006/relationships" xmlns:m="http://schemas.openxmlformats.org/officeDocument/2006/math" xmlns:v="urn:schemas-microsoft-com:vml" xmlns:wp14="http://schemas.microsoft.com/office/word/2010/wordprocessingDrawing" xmlns:wp="http://schemas.openxmlformats.org/drawingml/2006/wordprocessingDrawing" xmlns:w10="urn:schemas-microsoft-com:office:word" xmlns:w="http://schemas.openxmlformats.org/wordprocessingml/2006/main" xmlns:w14="http://schemas.microsoft.com/office/word/2010/wordml" xmlns:w15="http://schemas.microsoft.com/office/word/2012/wordml" xmlns:w16cex="http://schemas.microsoft.com/office/word/2018/wordml/cex" xmlns:w16cid="http://schemas.microsoft.com/office/word/2016/wordml/cid" xmlns:w16="http://schemas.microsoft.com/office/word/2018/wordml" xmlns:w16du="http://schemas.microsoft.com/office/word/2023/wordml/word16du" xmlns:w16sdtdh="http://schemas.microsoft.com/office/word/2020/wordml/sdtdatahash" xmlns:w16sdtfl="http://schemas.microsoft.com/office/word/2024/wordml/sdtformatlock" xmlns:w16se="http://schemas.microsoft.com/office/word/2015/wordml/symex" xmlns:wpg="http://schemas.microsoft.com/office/word/2010/wordprocessingGroup" xmlns:wpi="http://schemas.microsoft.com/office/word/2010/wordprocessingInk" xmlns:wne="http://schemas.microsoft.com/office/word/2006/wordml" xmlns:wps="http://schemas.microsoft.com/office/word/2010/wordprocessingShape" mc:Ignorable="w14 w15 w16se w16cid w16 w16cex w16sdtdh w16sdtfl w16du wp14">
   <w:abstractNum w:abstractNumId="0" w15:restartNumberingAfterBreak="0">
-    <w:nsid w:val="002B0E9B"/>
+    <w:nsid w:val="252C3142"/>
     <w:multiLevelType w:val="multilevel"/>
-    <w:tmpl w:val="FE327F24"/>
+    <w:tmpl w:val="F6549D86"/>
     <w:lvl w:ilvl="0">
       <w:start w:val="1"/>
       <w:numFmt w:val="bullet"/>
@@ -1291,9 +1376,9 @@
     </w:lvl>
   </w:abstractNum>
   <w:abstractNum w:abstractNumId="1" w15:restartNumberingAfterBreak="0">
-    <w:nsid w:val="0DCB56F7"/>
+    <w:nsid w:val="2CCE2793"/>
     <w:multiLevelType w:val="multilevel"/>
-    <w:tmpl w:val="187CA788"/>
+    <w:tmpl w:val="E64A44FA"/>
     <w:lvl w:ilvl="0">
       <w:start w:val="1"/>
       <w:numFmt w:val="bullet"/>
@@ -1310,7 +1395,7 @@
         <w:sz w:val="20"/>
       </w:rPr>
     </w:lvl>
-    <w:lvl w:ilvl="1" w:tentative="1">
+    <w:lvl w:ilvl="1">
       <w:start w:val="1"/>
       <w:numFmt w:val="bullet"/>
       <w:lvlText w:val="o"/>
@@ -1440,9 +1525,9 @@
     </w:lvl>
   </w:abstractNum>
   <w:abstractNum w:abstractNumId="2" w15:restartNumberingAfterBreak="0">
-    <w:nsid w:val="3BBF3DDE"/>
+    <w:nsid w:val="45DB1FA0"/>
     <w:multiLevelType w:val="multilevel"/>
-    <w:tmpl w:val="6C6849DC"/>
+    <w:tmpl w:val="CCD6C41A"/>
     <w:lvl w:ilvl="0">
       <w:start w:val="1"/>
       <w:numFmt w:val="bullet"/>
@@ -1589,9 +1674,9 @@
     </w:lvl>
   </w:abstractNum>
   <w:abstractNum w:abstractNumId="3" w15:restartNumberingAfterBreak="0">
-    <w:nsid w:val="5C2533AA"/>
+    <w:nsid w:val="72F153F2"/>
     <w:multiLevelType w:val="multilevel"/>
-    <w:tmpl w:val="71CE83DE"/>
+    <w:tmpl w:val="47C6E61C"/>
     <w:lvl w:ilvl="0">
       <w:start w:val="1"/>
       <w:numFmt w:val="bullet"/>
@@ -1608,7 +1693,7 @@
         <w:sz w:val="20"/>
       </w:rPr>
     </w:lvl>
-    <w:lvl w:ilvl="1">
+    <w:lvl w:ilvl="1" w:tentative="1">
       <w:start w:val="1"/>
       <w:numFmt w:val="bullet"/>
       <w:lvlText w:val="o"/>
@@ -1737,17 +1822,17 @@
       </w:rPr>
     </w:lvl>
   </w:abstractNum>
-  <w:num w:numId="1" w16cid:durableId="2070759468">
+  <w:num w:numId="1" w16cid:durableId="1531841660">
     <w:abstractNumId w:val="2"/>
   </w:num>
-  <w:num w:numId="2" w16cid:durableId="1170095480">
+  <w:num w:numId="2" w16cid:durableId="1711491814">
+    <w:abstractNumId w:val="0"/>
+  </w:num>
+  <w:num w:numId="3" w16cid:durableId="1038049576">
     <w:abstractNumId w:val="1"/>
   </w:num>
-  <w:num w:numId="3" w16cid:durableId="1079904702">
+  <w:num w:numId="4" w16cid:durableId="532773095">
     <w:abstractNumId w:val="3"/>
-  </w:num>
-  <w:num w:numId="4" w16cid:durableId="2062240839">
-    <w:abstractNumId w:val="0"/>
   </w:num>
 </w:numbering>
 </file>
@@ -1757,11 +1842,11 @@
   <w:docDefaults>
     <w:rPrDefault>
       <w:rPr>
-        <w:rFonts w:asciiTheme="minorHAnsi" w:eastAsiaTheme="minorEastAsia" w:hAnsiTheme="minorHAnsi" w:cstheme="minorBidi"/>
+        <w:rFonts w:asciiTheme="minorHAnsi" w:eastAsiaTheme="minorHAnsi" w:hAnsiTheme="minorHAnsi" w:cstheme="minorBidi"/>
         <w:kern w:val="2"/>
         <w:sz w:val="24"/>
         <w:szCs w:val="24"/>
-        <w:lang w:val="en-US" w:eastAsia="zh-CN" w:bidi="ar-SA"/>
+        <w:lang w:val="en-US" w:eastAsia="en-US" w:bidi="ar-SA"/>
         <w14:ligatures w14:val="standardContextual"/>
       </w:rPr>
     </w:rPrDefault>
@@ -2160,7 +2245,7 @@
     <w:link w:val="Heading1Char"/>
     <w:uiPriority w:val="9"/>
     <w:qFormat/>
-    <w:rsid w:val="00966930"/>
+    <w:rsid w:val="006C625A"/>
     <w:pPr>
       <w:keepNext/>
       <w:keepLines/>
@@ -2180,10 +2265,9 @@
     <w:next w:val="Normal"/>
     <w:link w:val="Heading2Char"/>
     <w:uiPriority w:val="9"/>
-    <w:semiHidden/>
     <w:unhideWhenUsed/>
     <w:qFormat/>
-    <w:rsid w:val="00966930"/>
+    <w:rsid w:val="006C625A"/>
     <w:pPr>
       <w:keepNext/>
       <w:keepLines/>
@@ -2206,7 +2290,7 @@
     <w:semiHidden/>
     <w:unhideWhenUsed/>
     <w:qFormat/>
-    <w:rsid w:val="00966930"/>
+    <w:rsid w:val="006C625A"/>
     <w:pPr>
       <w:keepNext/>
       <w:keepLines/>
@@ -2229,7 +2313,7 @@
     <w:semiHidden/>
     <w:unhideWhenUsed/>
     <w:qFormat/>
-    <w:rsid w:val="00966930"/>
+    <w:rsid w:val="006C625A"/>
     <w:pPr>
       <w:keepNext/>
       <w:keepLines/>
@@ -2252,7 +2336,7 @@
     <w:semiHidden/>
     <w:unhideWhenUsed/>
     <w:qFormat/>
-    <w:rsid w:val="00966930"/>
+    <w:rsid w:val="006C625A"/>
     <w:pPr>
       <w:keepNext/>
       <w:keepLines/>
@@ -2273,7 +2357,7 @@
     <w:semiHidden/>
     <w:unhideWhenUsed/>
     <w:qFormat/>
-    <w:rsid w:val="00966930"/>
+    <w:rsid w:val="006C625A"/>
     <w:pPr>
       <w:keepNext/>
       <w:keepLines/>
@@ -2296,7 +2380,7 @@
     <w:semiHidden/>
     <w:unhideWhenUsed/>
     <w:qFormat/>
-    <w:rsid w:val="00966930"/>
+    <w:rsid w:val="006C625A"/>
     <w:pPr>
       <w:keepNext/>
       <w:keepLines/>
@@ -2317,7 +2401,7 @@
     <w:semiHidden/>
     <w:unhideWhenUsed/>
     <w:qFormat/>
-    <w:rsid w:val="00966930"/>
+    <w:rsid w:val="006C625A"/>
     <w:pPr>
       <w:keepNext/>
       <w:keepLines/>
@@ -2340,7 +2424,7 @@
     <w:semiHidden/>
     <w:unhideWhenUsed/>
     <w:qFormat/>
-    <w:rsid w:val="00966930"/>
+    <w:rsid w:val="006C625A"/>
     <w:pPr>
       <w:keepNext/>
       <w:keepLines/>
@@ -2383,7 +2467,7 @@
     <w:basedOn w:val="DefaultParagraphFont"/>
     <w:link w:val="Heading1"/>
     <w:uiPriority w:val="9"/>
-    <w:rsid w:val="00966930"/>
+    <w:rsid w:val="006C625A"/>
     <w:rPr>
       <w:rFonts w:asciiTheme="majorHAnsi" w:eastAsiaTheme="majorEastAsia" w:hAnsiTheme="majorHAnsi" w:cstheme="majorBidi"/>
       <w:color w:val="0F4761" w:themeColor="accent1" w:themeShade="BF"/>
@@ -2396,8 +2480,7 @@
     <w:basedOn w:val="DefaultParagraphFont"/>
     <w:link w:val="Heading2"/>
     <w:uiPriority w:val="9"/>
-    <w:semiHidden/>
-    <w:rsid w:val="00966930"/>
+    <w:rsid w:val="006C625A"/>
     <w:rPr>
       <w:rFonts w:asciiTheme="majorHAnsi" w:eastAsiaTheme="majorEastAsia" w:hAnsiTheme="majorHAnsi" w:cstheme="majorBidi"/>
       <w:color w:val="0F4761" w:themeColor="accent1" w:themeShade="BF"/>
@@ -2411,7 +2494,7 @@
     <w:link w:val="Heading3"/>
     <w:uiPriority w:val="9"/>
     <w:semiHidden/>
-    <w:rsid w:val="00966930"/>
+    <w:rsid w:val="006C625A"/>
     <w:rPr>
       <w:rFonts w:eastAsiaTheme="majorEastAsia" w:cstheme="majorBidi"/>
       <w:color w:val="0F4761" w:themeColor="accent1" w:themeShade="BF"/>
@@ -2425,7 +2508,7 @@
     <w:link w:val="Heading4"/>
     <w:uiPriority w:val="9"/>
     <w:semiHidden/>
-    <w:rsid w:val="00966930"/>
+    <w:rsid w:val="006C625A"/>
     <w:rPr>
       <w:rFonts w:eastAsiaTheme="majorEastAsia" w:cstheme="majorBidi"/>
       <w:i/>
@@ -2439,7 +2522,7 @@
     <w:link w:val="Heading5"/>
     <w:uiPriority w:val="9"/>
     <w:semiHidden/>
-    <w:rsid w:val="00966930"/>
+    <w:rsid w:val="006C625A"/>
     <w:rPr>
       <w:rFonts w:eastAsiaTheme="majorEastAsia" w:cstheme="majorBidi"/>
       <w:color w:val="0F4761" w:themeColor="accent1" w:themeShade="BF"/>
@@ -2451,7 +2534,7 @@
     <w:link w:val="Heading6"/>
     <w:uiPriority w:val="9"/>
     <w:semiHidden/>
-    <w:rsid w:val="00966930"/>
+    <w:rsid w:val="006C625A"/>
     <w:rPr>
       <w:rFonts w:eastAsiaTheme="majorEastAsia" w:cstheme="majorBidi"/>
       <w:i/>
@@ -2465,7 +2548,7 @@
     <w:link w:val="Heading7"/>
     <w:uiPriority w:val="9"/>
     <w:semiHidden/>
-    <w:rsid w:val="00966930"/>
+    <w:rsid w:val="006C625A"/>
     <w:rPr>
       <w:rFonts w:eastAsiaTheme="majorEastAsia" w:cstheme="majorBidi"/>
       <w:color w:val="595959" w:themeColor="text1" w:themeTint="A6"/>
@@ -2477,7 +2560,7 @@
     <w:link w:val="Heading8"/>
     <w:uiPriority w:val="9"/>
     <w:semiHidden/>
-    <w:rsid w:val="00966930"/>
+    <w:rsid w:val="006C625A"/>
     <w:rPr>
       <w:rFonts w:eastAsiaTheme="majorEastAsia" w:cstheme="majorBidi"/>
       <w:i/>
@@ -2491,7 +2574,7 @@
     <w:link w:val="Heading9"/>
     <w:uiPriority w:val="9"/>
     <w:semiHidden/>
-    <w:rsid w:val="00966930"/>
+    <w:rsid w:val="006C625A"/>
     <w:rPr>
       <w:rFonts w:eastAsiaTheme="majorEastAsia" w:cstheme="majorBidi"/>
       <w:color w:val="272727" w:themeColor="text1" w:themeTint="D8"/>
@@ -2504,7 +2587,7 @@
     <w:link w:val="TitleChar"/>
     <w:uiPriority w:val="10"/>
     <w:qFormat/>
-    <w:rsid w:val="00966930"/>
+    <w:rsid w:val="006C625A"/>
     <w:pPr>
       <w:spacing w:after="80" w:line="240" w:lineRule="auto"/>
       <w:contextualSpacing/>
@@ -2522,7 +2605,7 @@
     <w:basedOn w:val="DefaultParagraphFont"/>
     <w:link w:val="Title"/>
     <w:uiPriority w:val="10"/>
-    <w:rsid w:val="00966930"/>
+    <w:rsid w:val="006C625A"/>
     <w:rPr>
       <w:rFonts w:asciiTheme="majorHAnsi" w:eastAsiaTheme="majorEastAsia" w:hAnsiTheme="majorHAnsi" w:cstheme="majorBidi"/>
       <w:spacing w:val="-10"/>
@@ -2538,7 +2621,7 @@
     <w:link w:val="SubtitleChar"/>
     <w:uiPriority w:val="11"/>
     <w:qFormat/>
-    <w:rsid w:val="00966930"/>
+    <w:rsid w:val="006C625A"/>
     <w:pPr>
       <w:numPr>
         <w:ilvl w:val="1"/>
@@ -2557,7 +2640,7 @@
     <w:basedOn w:val="DefaultParagraphFont"/>
     <w:link w:val="Subtitle"/>
     <w:uiPriority w:val="11"/>
-    <w:rsid w:val="00966930"/>
+    <w:rsid w:val="006C625A"/>
     <w:rPr>
       <w:rFonts w:eastAsiaTheme="majorEastAsia" w:cstheme="majorBidi"/>
       <w:color w:val="595959" w:themeColor="text1" w:themeTint="A6"/>
@@ -2573,7 +2656,7 @@
     <w:link w:val="QuoteChar"/>
     <w:uiPriority w:val="29"/>
     <w:qFormat/>
-    <w:rsid w:val="00966930"/>
+    <w:rsid w:val="006C625A"/>
     <w:pPr>
       <w:spacing w:before="160"/>
       <w:jc w:val="center"/>
@@ -2589,7 +2672,7 @@
     <w:basedOn w:val="DefaultParagraphFont"/>
     <w:link w:val="Quote"/>
     <w:uiPriority w:val="29"/>
-    <w:rsid w:val="00966930"/>
+    <w:rsid w:val="006C625A"/>
     <w:rPr>
       <w:i/>
       <w:iCs/>
@@ -2601,7 +2684,7 @@
     <w:basedOn w:val="Normal"/>
     <w:uiPriority w:val="34"/>
     <w:qFormat/>
-    <w:rsid w:val="00966930"/>
+    <w:rsid w:val="006C625A"/>
     <w:pPr>
       <w:ind w:left="720"/>
       <w:contextualSpacing/>
@@ -2612,7 +2695,7 @@
     <w:basedOn w:val="DefaultParagraphFont"/>
     <w:uiPriority w:val="21"/>
     <w:qFormat/>
-    <w:rsid w:val="00966930"/>
+    <w:rsid w:val="006C625A"/>
     <w:rPr>
       <w:i/>
       <w:iCs/>
@@ -2626,7 +2709,7 @@
     <w:link w:val="IntenseQuoteChar"/>
     <w:uiPriority w:val="30"/>
     <w:qFormat/>
-    <w:rsid w:val="00966930"/>
+    <w:rsid w:val="006C625A"/>
     <w:pPr>
       <w:pBdr>
         <w:top w:val="single" w:sz="4" w:space="10" w:color="0F4761" w:themeColor="accent1" w:themeShade="BF"/>
@@ -2647,7 +2730,7 @@
     <w:basedOn w:val="DefaultParagraphFont"/>
     <w:link w:val="IntenseQuote"/>
     <w:uiPriority w:val="30"/>
-    <w:rsid w:val="00966930"/>
+    <w:rsid w:val="006C625A"/>
     <w:rPr>
       <w:i/>
       <w:iCs/>
@@ -2659,7 +2742,7 @@
     <w:basedOn w:val="DefaultParagraphFont"/>
     <w:uiPriority w:val="32"/>
     <w:qFormat/>
-    <w:rsid w:val="00966930"/>
+    <w:rsid w:val="006C625A"/>
     <w:rPr>
       <w:b/>
       <w:bCs/>
@@ -2769,7 +2852,7 @@
         <a:latin typeface="Aptos" panose="02110004020202020204"/>
         <a:ea typeface=""/>
         <a:cs typeface=""/>
-        <a:font script="Jpan" typeface="游ゴシック"/>
+        <a:font script="Jpan" typeface="游明朝"/>
         <a:font script="Hang" typeface="맑은 고딕"/>
         <a:font script="Hans" typeface="等线"/>
         <a:font script="Hant" typeface="新細明體"/>
@@ -2877,13 +2960,6 @@
         </a:gradFill>
       </a:fillStyleLst>
       <a:lnStyleLst>
-        <a:ln w="6350" cap="flat" cmpd="sng" algn="ctr">
-          <a:solidFill>
-            <a:schemeClr val="phClr"/>
-          </a:solidFill>
-          <a:prstDash val="solid"/>
-          <a:miter lim="800000"/>
-        </a:ln>
         <a:ln w="12700" cap="flat" cmpd="sng" algn="ctr">
           <a:solidFill>
             <a:schemeClr val="phClr"/>
@@ -2892,6 +2968,13 @@
           <a:miter lim="800000"/>
         </a:ln>
         <a:ln w="19050" cap="flat" cmpd="sng" algn="ctr">
+          <a:solidFill>
+            <a:schemeClr val="phClr"/>
+          </a:solidFill>
+          <a:prstDash val="solid"/>
+          <a:miter lim="800000"/>
+        </a:ln>
+        <a:ln w="25400" cap="flat" cmpd="sng" algn="ctr">
           <a:solidFill>
             <a:schemeClr val="phClr"/>
           </a:solidFill>
@@ -2956,11 +3039,31 @@
       </a:bgFillStyleLst>
     </a:fmtScheme>
   </a:themeElements>
-  <a:objectDefaults/>
+  <a:objectDefaults>
+    <a:lnDef>
+      <a:spPr/>
+      <a:bodyPr/>
+      <a:lstStyle/>
+      <a:style>
+        <a:lnRef idx="2">
+          <a:schemeClr val="accent1"/>
+        </a:lnRef>
+        <a:fillRef idx="0">
+          <a:schemeClr val="accent1"/>
+        </a:fillRef>
+        <a:effectRef idx="1">
+          <a:schemeClr val="accent1"/>
+        </a:effectRef>
+        <a:fontRef idx="minor">
+          <a:schemeClr val="tx1"/>
+        </a:fontRef>
+      </a:style>
+    </a:lnDef>
+  </a:objectDefaults>
   <a:extraClrSchemeLst/>
   <a:extLst>
     <a:ext uri="{05A4C25C-085E-4340-85A3-A5531E510DB2}">
-      <thm15:themeFamily xmlns:thm15="http://schemas.microsoft.com/office/thememl/2012/main" name="Office Theme" id="{62F939B6-93AF-4DB8-9C6B-D6C7DFDC589F}" vid="{4A3C46E8-61CC-4603-A589-7422A47A8E4A}"/>
+      <thm15:themeFamily xmlns:thm15="http://schemas.microsoft.com/office/thememl/2012/main" name="Office Theme" id="{2E142A2C-CD16-42D6-873A-C26D2A0506FA}" vid="{1BDDFF52-6CD6-40A5-AB3C-68EB2F1E4D0A}"/>
     </a:ext>
   </a:extLst>
 </a:theme>

</xml_diff>